<commit_message>
docs: state StockSenate as a self-developed product (DEC-012)
Remove comparative framing from README, specs, config comments and the
validation message; align the decision and task records with the new
wording. Document the policy in DEC-012.

Capability gates, link count (25) and test behaviour are unchanged.
</commit_message>
<xml_diff>
--- a/councli.docx
+++ b/councli.docx
@@ -125,7 +125,7 @@
       </w:pPr>
       <w:r>
         <w:rPr/>
-        <w:t>说明：文中 [R1] 等编号对应第十八章“参考链接汇总”。发布前需逐项核验链接、许可证、PyPI 名称和命令占用情况；这些属于上线核验项，不是架构设计疑问。</w:t>
+        <w:t>说明：文中 [R1] 等编号对应第十八章“外部链接汇总”。发布前需逐项核验链接、许可证、PyPI 名称和命令占用情况；这些属于上线核验项，不是架构设计疑问。</w:t>
       </w:r>
     </w:p>
     <w:p>
@@ -177,39 +177,39 @@
       </w:pPr>
       <w:r>
         <w:rPr/>
-        <w:t>原版 7 角色、多空辩论、研究经理、交易员、三档风险辩论、投资经理终审完整保留；</w:t>
-      </w:r>
-    </w:p>
-    <w:p>
-      <w:pPr>
-        <w:pStyle w:val="shimo normal"/>
-        <w:spacing w:line="240"/>
-      </w:pPr>
-    </w:p>
-    <w:p>
-      <w:pPr>
-        <w:pStyle w:val="shimo normal"/>
-        <w:spacing w:line="240"/>
-      </w:pPr>
-      <w:r>
-        <w:rPr/>
-        <w:t>原版 CLI、Streamlit WebUI、Python API、报告输出、LangGraph checkpoint 完整保留；</w:t>
-      </w:r>
-    </w:p>
-    <w:p>
-      <w:pPr>
-        <w:pStyle w:val="shimo normal"/>
-        <w:spacing w:line="240"/>
-      </w:pPr>
-    </w:p>
-    <w:p>
-      <w:pPr>
-        <w:pStyle w:val="shimo normal"/>
-        <w:spacing w:line="240"/>
-      </w:pPr>
-      <w:r>
-        <w:rPr/>
-        <w:t>原版全部 Issue 逐项解决；</w:t>
+        <w:t>内置 7 角色、多空辩论、研究经理、交易员、三档风险辩论、投资经理终审完整保留；</w:t>
+      </w:r>
+    </w:p>
+    <w:p>
+      <w:pPr>
+        <w:pStyle w:val="shimo normal"/>
+        <w:spacing w:line="240"/>
+      </w:pPr>
+    </w:p>
+    <w:p>
+      <w:pPr>
+        <w:pStyle w:val="shimo normal"/>
+        <w:spacing w:line="240"/>
+      </w:pPr>
+      <w:r>
+        <w:rPr/>
+        <w:t>内置 CLI、Streamlit WebUI、Python API、报告输出、LangGraph checkpoint 完整保留；</w:t>
+      </w:r>
+    </w:p>
+    <w:p>
+      <w:pPr>
+        <w:pStyle w:val="shimo normal"/>
+        <w:spacing w:line="240"/>
+      </w:pPr>
+    </w:p>
+    <w:p>
+      <w:pPr>
+        <w:pStyle w:val="shimo normal"/>
+        <w:spacing w:line="240"/>
+      </w:pPr>
+      <w:r>
+        <w:rPr/>
+        <w:t>全部 Issue 逐项闭环；</w:t>
       </w:r>
     </w:p>
     <w:p>
@@ -797,7 +797,7 @@
       </w:pPr>
       <w:r>
         <w:rPr/>
-        <w:t>原版 propagate 返回 (final_state, decision) 元组。改造后必须保持该返回值签名不变；summary.json、complete_report.md 是衍生输出，不是替代返回值。验收时需做返回值契约测试。</w:t>
+        <w:t>既有 propagate 返回 (final_state, decision) 元组。改造后必须保持该返回值签名不变；summary.json、complete_report.md 是衍生输出，不是替代返回值。验收时需做返回值契约测试。</w:t>
       </w:r>
     </w:p>
     <w:p>
@@ -823,7 +823,7 @@
       </w:pPr>
       <w:r>
         <w:rPr/>
-        <w:t>原版已支持 role_llms 细粒度配置，可为单个角色指定不同供应商模型。Council 必须继承并兼容该能力，不能只保留“快思考/深思考”两级。</w:t>
+        <w:t>既有实现已支持 role_llms 细粒度配置，可为单个角色指定不同供应商模型。Council 必须继承并兼容该能力，不能只保留“快思考/深思考”两级。</w:t>
       </w:r>
     </w:p>
     <w:p>
@@ -849,7 +849,7 @@
       </w:pPr>
       <w:r>
         <w:rPr/>
-        <w:t>原版 README 明确说明该功能是决策事后归因统计，不是回测、不是策略业绩。Council 文档中“完整回测引擎”是新增能力，必须与 performance 分开描述、分开验收，不能混为一谈。</w:t>
+        <w:t>现有 README 明确说明该功能是决策事后归因统计，不是回测、不是策略业绩。Council 文档中“完整回测引擎”是新增能力，必须与 performance 分开描述、分开验收，不能混为一谈。</w:t>
       </w:r>
     </w:p>
     <w:p>
@@ -875,7 +875,7 @@
       </w:pPr>
       <w:r>
         <w:rPr/>
-        <w:t>原版自带 A 股数据供应商并直连免费源。Council 将其迁移到 StockData 底座属于架构重构，不是简单新增功能；需评估对原数据质量测试的影响，并保留迁移期兼容开关。</w:t>
+        <w:t>既有实现自带 A 股数据供应商并直连免费源。Council 将其迁移到 StockData 底座属于架构重构，不是简单新增功能；需评估对原数据质量测试的影响，并保留迁移期兼容开关。</w:t>
       </w:r>
     </w:p>
     <w:p>
@@ -901,7 +901,7 @@
       </w:pPr>
       <w:r>
         <w:rPr/>
-        <w:t>原版强调面向研究与教学、不构成投资建议、不产出可执行价位。Council 对外表述必须延续该边界，避免用户产生“荐股”预期。</w:t>
+        <w:t>既有实现强调面向研究与教学、不构成投资建议、不产出可执行价位。Council 对外表述必须延续该边界，避免用户产生“荐股”预期。</w:t>
       </w:r>
     </w:p>
     <w:p>
@@ -1157,19 +1157,19 @@
       </w:pPr>
       <w:r>
         <w:rPr/>
-        <w:t>四、原版能力 100% 复现清单</w:t>
-      </w:r>
-    </w:p>
-    <w:p>
-      <w:pPr>
-        <w:pStyle w:val="shimo normal"/>
-        <w:spacing w:line="240"/>
-      </w:pPr>
-      <w:r>
-        <w:rPr/>
-        <w:t>原版能力</w:t>
-        <w:tab/>
-        <w:t>复现要求</w:t>
+        <w:t>四、基础能力清单</w:t>
+      </w:r>
+    </w:p>
+    <w:p>
+      <w:pPr>
+        <w:pStyle w:val="shimo normal"/>
+        <w:spacing w:line="240"/>
+      </w:pPr>
+      <w:r>
+        <w:rPr/>
+        <w:t>基础能力</w:t>
+        <w:tab/>
+        <w:t>实现要求</w:t>
         <w:tab/>
         <w:t>验收方式</w:t>
       </w:r>
@@ -1197,7 +1197,7 @@
         <w:rPr/>
         <w:t>多空辩论 + 研究经理综合 + 交易员规划 + 三档风险辩论 + 投资经理终审</w:t>
         <w:tab/>
-        <w:t>完整复现</w:t>
+        <w:t>完整覆盖</w:t>
         <w:tab/>
         <w:t>工作流节点快照对比</w:t>
       </w:r>
@@ -1405,7 +1405,7 @@
       </w:pPr>
       <w:r>
         <w:rPr/>
-        <w:t>五、原版 Issue 100% 解决方案</w:t>
+        <w:t>五、Issue 闭环清单</w:t>
       </w:r>
     </w:p>
     <w:p>
@@ -3713,7 +3713,7 @@
       </w:pPr>
       <w:r>
         <w:rPr/>
-        <w:t>基本面、技术面、情绪、新闻、政策、游资龙虎榜、解禁监控，全部保留原版逻辑。</w:t>
+        <w:t>基本面、技术面、情绪、新闻、政策、游资龙虎榜、解禁监控，全部保留内置逻辑。</w:t>
       </w:r>
     </w:p>
     <w:p>
@@ -5467,7 +5467,7 @@
       </w:pPr>
       <w:r>
         <w:rPr/>
-        <w:t>原版回归、StockData 联调、数据源可插拔、弱模型降级、增量分析、回测正确性、告警、依赖兼容、CI/lock、MCP、安全、自定义角色回归、旧命令兼容、配置迁移。</w:t>
+        <w:t>基础能力回归、StockData 联调、数据源可插拔、弱模型降级、增量分析、回测正确性、告警、依赖兼容、CI/lock、MCP、安全、自定义角色回归、旧命令兼容、配置迁移。</w:t>
       </w:r>
     </w:p>
     <w:p>
@@ -5493,23 +5493,23 @@
       </w:pPr>
       <w:r>
         <w:rPr/>
-        <w:t>原版用户升级零改动；</w:t>
-      </w:r>
-    </w:p>
-    <w:p>
-      <w:pPr>
-        <w:pStyle w:val="shimo normal"/>
-        <w:spacing w:line="240"/>
-      </w:pPr>
-    </w:p>
-    <w:p>
-      <w:pPr>
-        <w:pStyle w:val="shimo normal"/>
-        <w:spacing w:line="240"/>
-      </w:pPr>
-      <w:r>
-        <w:rPr/>
-        <w:t>原版 100% 能力回归通过；</w:t>
+        <w:t>既有用户升级零改动；</w:t>
+      </w:r>
+    </w:p>
+    <w:p>
+      <w:pPr>
+        <w:pStyle w:val="shimo normal"/>
+        <w:spacing w:line="240"/>
+      </w:pPr>
+    </w:p>
+    <w:p>
+      <w:pPr>
+        <w:pStyle w:val="shimo normal"/>
+        <w:spacing w:line="240"/>
+      </w:pPr>
+      <w:r>
+        <w:rPr/>
+        <w:t>基础能力回归全部通过；</w:t>
       </w:r>
     </w:p>
     <w:p>
@@ -5849,7 +5849,7 @@
       </w:pPr>
       <w:r>
         <w:rPr/>
-        <w:t>“100% 复现/解决”以接口契约和回归测试验收；</w:t>
+        <w:t>“能力完整/Issue 闭环”以接口契约和回归测试验收；</w:t>
       </w:r>
     </w:p>
     <w:p>
@@ -5923,9 +5923,9 @@
         <w:rPr/>
         <w:t>M0 兼容基线</w:t>
         <w:tab/>
-        <w:t>原版 100% 复现；StockData 三模式；DataProvider 可插拔；依赖冲突根治；CI/lock；英文文档修复</w:t>
-        <w:tab/>
-        <w:t>原版回归；stockdata/local/hybrid 可用</w:t>
+        <w:t>基础能力完整；StockData 三模式；DataProvider 可插拔；依赖冲突根治；CI/lock；英文文档修复</w:t>
+        <w:tab/>
+        <w:t>基础能力回归；stockdata/local/hybrid 可用</w:t>
       </w:r>
     </w:p>
     <w:p>
@@ -5991,7 +5991,7 @@
       </w:pPr>
       <w:r>
         <w:rPr/>
-        <w:t>十八、参考链接汇总</w:t>
+        <w:t>十八、外部链接汇总</w:t>
       </w:r>
     </w:p>
     <w:p>
@@ -6019,7 +6019,7 @@
         <w:rPr/>
         <w:t>R1</w:t>
         <w:tab/>
-        <w:t>原 TradingAgents-astock 仓库</w:t>
+        <w:t>TradingAgents-astock 公开仓库</w:t>
         <w:tab/>
         <w:tab/>
         <w:t xml:space="preserve"/>
@@ -6036,7 +6036,7 @@
       <w:r>
         <w:rPr/>
         <w:tab/>
-        <w:t>原版能力与 Issue 对齐</w:t>
+        <w:t>基础能力与 Issue 对齐</w:t>
       </w:r>
     </w:p>
     <w:p>
@@ -6048,7 +6048,7 @@
         <w:rPr/>
         <w:t>R2</w:t>
         <w:tab/>
-        <w:t>QuotaFuse StockData 参考仓库</w:t>
+        <w:t>QuotaFuse StockData 公开仓库</w:t>
         <w:tab/>
         <w:tab/>
         <w:t xml:space="preserve"/>
@@ -6065,7 +6065,7 @@
       <w:r>
         <w:rPr/>
         <w:tab/>
-        <w:t>StockData 兼容参考</w:t>
+        <w:t>StockData 兼容性对照</w:t>
       </w:r>
     </w:p>
     <w:p>
@@ -6413,7 +6413,7 @@
       <w:r>
         <w:rPr/>
         <w:tab/>
-        <w:t>数据源参考</w:t>
+        <w:t>数据源说明</w:t>
       </w:r>
     </w:p>
     <w:p>
@@ -6558,7 +6558,7 @@
       <w:r>
         <w:rPr/>
         <w:tab/>
-        <w:t>多模型网关参考</w:t>
+        <w:t>多模型网关文档</w:t>
       </w:r>
     </w:p>
     <w:p>
@@ -6674,7 +6674,7 @@
       <w:r>
         <w:rPr/>
         <w:tab/>
-        <w:t>多数据库落库参考</w:t>
+        <w:t>多数据库落库文档</w:t>
       </w:r>
     </w:p>
     <w:p>
@@ -6784,7 +6784,7 @@
       </w:pPr>
       <w:r>
         <w:rPr/>
-        <w:t>核验 R15、R20 等参考链接发布时是否仍有效；</w:t>
+        <w:t>核验 R15、R20 等外部链接发布时是否仍有效；</w:t>
       </w:r>
     </w:p>
     <w:p>

</xml_diff>